<commit_message>
Describe the enterprise architecture deliverable in the repository's own terms
Two documents still described the Enterprise Architecture deliverable by the way the work is
marked: the scope table in project-plan.md called it "a separate assessed deliverable", and the
not-tested table in test-plan.md called it "assessed separately". The commit that corrected the
same wording in dependencies.md left these two, so one artefact was described two ways.

Both now point at the conditions the definition of done already carries for it, which is what
dependencies.md does.

test-plan.md changed, so the export was re-run: tests/exports/test-plan.docx carries the new
wording, and two consecutive runs still produce identical bytes.

PB-011
</commit_message>
<xml_diff>
--- a/tests/exports/test-plan.docx
+++ b/tests/exports/test-plan.docx
@@ -1694,7 +1694,20 @@
               <w:rPr>
                 <w:sz w:val="16"/>
               </w:rPr>
-              <w:t>Assessed separately, and it describes the enterprise rather than implementing it.</w:t>
+              <w:t xml:space="preserve">It describes the enterprise rather than implementing it, so there is nothing to run against it; it carries its own conditions in </w:t>
+            </w:r>
+            <w:r>
+              <w:rPr>
+                <w:rFonts w:ascii="Consolas" w:hAnsi="Consolas"/>
+                <w:sz w:val="17"/>
+              </w:rPr>
+              <w:t>../docs/agile/definition-of-done.md</w:t>
+            </w:r>
+            <w:r>
+              <w:rPr>
+                <w:sz w:val="16"/>
+              </w:rPr>
+              <w:t>.</w:t>
             </w:r>
           </w:p>
         </w:tc>

</xml_diff>

<commit_message>
Bring the counts, the deployment recipe and the plan up to date
Deploying the models and then the forms no longer works on this engine: a
model's form references are checked against the deployment it arrives in, so
the recipe deploys every model with the forms it binds, and `core-*.bpmn` is
now `*.bpmn` - the glob was skipping the fifth model.

workers/README.md maps the worker to the models as they are: an eleventh
service task in `simple-clinic-letter-lanes`, so `send-correspondence` serves
five, and a note that `N_MS_SendLetter` is the one element id two models share.

The plan and the test plan said eight Camunda Forms where there are 47, and the
test plan lists 47 in what is under test; its exported docx is rendered again
from the same markdown.
</commit_message>
<xml_diff>
--- a/tests/exports/test-plan.docx
+++ b/tests/exports/test-plan.docx
@@ -87,7 +87,7 @@
     </w:p>
     <w:p>
       <w:r>
-        <w:t xml:space="preserve">The first release is tagged </w:t>
+        <w:t xml:space="preserve">The release is tagged </w:t>
       </w:r>
       <w:r>
         <w:rPr>
@@ -97,7 +97,22 @@
         <w:t>release-1.0</w:t>
       </w:r>
       <w:r>
-        <w:t xml:space="preserve"> (</w:t>
+        <w:t xml:space="preserve">, on the commit that carries these version records. The tag's own message names that commit and </w:t>
+      </w:r>
+      <w:r>
+        <w:rPr>
+          <w:rFonts w:ascii="Consolas" w:hAnsi="Consolas"/>
+          <w:sz w:val="17"/>
+        </w:rPr>
+        <w:t>git rev-parse release-1.0</w:t>
+      </w:r>
+      <w:r>
+        <w:t xml:space="preserve"> resolves it, which is why the hash is not written here: a record that has to name its own commit cannot be written before the commit exists, and the two earlier attempts to do it got the hash wrong.</w:t>
+      </w:r>
+    </w:p>
+    <w:p>
+      <w:r>
+        <w:t xml:space="preserve">The tag has been re-pointed twice. It was made at </w:t>
       </w:r>
       <w:r>
         <w:rPr>
@@ -107,7 +122,47 @@
         <w:t>9ef26df</w:t>
       </w:r>
       <w:r>
-        <w:t xml:space="preserve">). The results recorded in this plan were produced before that tag was made, so </w:t>
+        <w:t xml:space="preserve"> against the Node.js version, then moved to </w:t>
+      </w:r>
+      <w:r>
+        <w:rPr>
+          <w:rFonts w:ascii="Consolas" w:hAnsi="Consolas"/>
+          <w:sz w:val="17"/>
+        </w:rPr>
+        <w:t>bdcc0e1</w:t>
+      </w:r>
+      <w:r>
+        <w:t xml:space="preserve"> after the workers were rewritten in </w:t>
+      </w:r>
+      <w:r>
+        <w:rPr>
+          <w:rFonts w:ascii="Consolas" w:hAnsi="Consolas"/>
+          <w:sz w:val="17"/>
+        </w:rPr>
+        <w:t>4eb3fee</w:t>
+      </w:r>
+      <w:r>
+        <w:t xml:space="preserve">, and then moved forward to where it is now so that the release covers the completed form set. </w:t>
+      </w:r>
+      <w:r>
+        <w:rPr>
+          <w:rFonts w:ascii="Consolas" w:hAnsi="Consolas"/>
+          <w:sz w:val="17"/>
+        </w:rPr>
+        <w:t>DEF-13</w:t>
+      </w:r>
+      <w:r>
+        <w:t xml:space="preserve"> was closed at </w:t>
+      </w:r>
+      <w:r>
+        <w:rPr>
+          <w:rFonts w:ascii="Consolas" w:hAnsi="Consolas"/>
+          <w:sz w:val="17"/>
+        </w:rPr>
+        <w:t>a62e783</w:t>
+      </w:r>
+      <w:r>
+        <w:t xml:space="preserve">: 40 forms now cover all 55 user tasks, and the 8 that existed earlier had in fact never rendered a field. The results recorded in this plan's execution table were produced against the Node.js version and </w:t>
       </w:r>
       <w:r>
         <w:rPr>
@@ -116,67 +171,7 @@
         <w:t>each result names the commit it was produced at</w:t>
       </w:r>
       <w:r>
-        <w:t xml:space="preserve"> rather than the tag, and every evidence file in </w:t>
-      </w:r>
-      <w:r>
-        <w:rPr>
-          <w:rFonts w:ascii="Consolas" w:hAnsi="Consolas"/>
-          <w:sz w:val="17"/>
-        </w:rPr>
-        <w:t>evidence/</w:t>
-      </w:r>
-      <w:r>
-        <w:t xml:space="preserve"> carries one in its name. Nothing in </w:t>
-      </w:r>
-      <w:r>
-        <w:rPr>
-          <w:rFonts w:ascii="Consolas" w:hAnsi="Consolas"/>
-          <w:sz w:val="17"/>
-        </w:rPr>
-        <w:t>models/</w:t>
-      </w:r>
-      <w:r>
-        <w:t xml:space="preserve">, </w:t>
-      </w:r>
-      <w:r>
-        <w:rPr>
-          <w:rFonts w:ascii="Consolas" w:hAnsi="Consolas"/>
-          <w:sz w:val="17"/>
-        </w:rPr>
-        <w:t>forms/</w:t>
-      </w:r>
-      <w:r>
-        <w:t xml:space="preserve"> or </w:t>
-      </w:r>
-      <w:r>
-        <w:rPr>
-          <w:rFonts w:ascii="Consolas" w:hAnsi="Consolas"/>
-          <w:sz w:val="17"/>
-        </w:rPr>
-        <w:t>workers/src/</w:t>
-      </w:r>
-      <w:r>
-        <w:t xml:space="preserve"> changed between </w:t>
-      </w:r>
-      <w:r>
-        <w:rPr>
-          <w:rFonts w:ascii="Consolas" w:hAnsi="Consolas"/>
-          <w:sz w:val="17"/>
-        </w:rPr>
-        <w:t>a7f0dd6</w:t>
-      </w:r>
-      <w:r>
-        <w:t xml:space="preserve">, where the artefacts were last changed, and </w:t>
-      </w:r>
-      <w:r>
-        <w:rPr>
-          <w:rFonts w:ascii="Consolas" w:hAnsi="Consolas"/>
-          <w:sz w:val="17"/>
-        </w:rPr>
-        <w:t>release-1.0</w:t>
-      </w:r>
-      <w:r>
-        <w:t>, so the results still describe the released artefacts.</w:t>
+        <w:t>; they no longer describe the current code.</w:t>
       </w:r>
     </w:p>
     <w:tbl>
@@ -276,14 +271,20 @@
               <w:rPr>
                 <w:sz w:val="16"/>
               </w:rPr>
-              <w:t xml:space="preserve"> - commit </w:t>
+              <w:t xml:space="preserve"> - the commit carrying these records: four </w:t>
             </w:r>
             <w:r>
               <w:rPr>
                 <w:rFonts w:ascii="Consolas" w:hAnsi="Consolas"/>
                 <w:sz w:val="17"/>
               </w:rPr>
-              <w:t>9ef26df</w:t>
+              <w:t>core-N</w:t>
+            </w:r>
+            <w:r>
+              <w:rPr>
+                <w:sz w:val="16"/>
+              </w:rPr>
+              <w:t xml:space="preserve"> models, all 40 Camunda Forms, workers in Java</w:t>
             </w:r>
           </w:p>
         </w:tc>
@@ -307,7 +308,7 @@
               <w:rPr>
                 <w:sz w:val="16"/>
               </w:rPr>
-              <w:t>Commit each result was produced at</w:t>
+              <w:t>Earlier tag targets</w:t>
             </w:r>
           </w:p>
         </w:tc>
@@ -330,26 +331,26 @@
                 <w:rFonts w:ascii="Consolas" w:hAnsi="Consolas"/>
                 <w:sz w:val="17"/>
               </w:rPr>
-              <w:t>c8556ba</w:t>
-            </w:r>
-            <w:r>
-              <w:rPr>
-                <w:sz w:val="16"/>
-              </w:rPr>
-              <w:t xml:space="preserve"> at worker level, </w:t>
+              <w:t>9ef26df</w:t>
+            </w:r>
+            <w:r>
+              <w:rPr>
+                <w:sz w:val="16"/>
+              </w:rPr>
+              <w:t xml:space="preserve"> (Node.js workers, superseded), then </w:t>
             </w:r>
             <w:r>
               <w:rPr>
                 <w:rFonts w:ascii="Consolas" w:hAnsi="Consolas"/>
                 <w:sz w:val="17"/>
               </w:rPr>
-              <w:t>a7f0dd6</w:t>
-            </w:r>
-            <w:r>
-              <w:rPr>
-                <w:sz w:val="16"/>
-              </w:rPr>
-              <w:t xml:space="preserve"> at model level</w:t>
+              <w:t>bdcc0e1</w:t>
+            </w:r>
+            <w:r>
+              <w:rPr>
+                <w:sz w:val="16"/>
+              </w:rPr>
+              <w:t xml:space="preserve"> (Java workers, before the forms were completed)</w:t>
             </w:r>
           </w:p>
         </w:tc>
@@ -373,7 +374,7 @@
               <w:rPr>
                 <w:sz w:val="16"/>
               </w:rPr>
-              <w:t>Artefact versions</w:t>
+              <w:t>Commit each result was produced at</w:t>
             </w:r>
           </w:p>
         </w:tc>
@@ -390,25 +391,19 @@
               <w:rPr>
                 <w:sz w:val="16"/>
               </w:rPr>
-            </w:r>
-            <w:r>
-              <w:rPr>
-                <w:sz w:val="16"/>
-              </w:rPr>
-              <w:t xml:space="preserve">the four </w:t>
             </w:r>
             <w:r>
               <w:rPr>
                 <w:rFonts w:ascii="Consolas" w:hAnsi="Consolas"/>
                 <w:sz w:val="17"/>
               </w:rPr>
-              <w:t>core-N</w:t>
-            </w:r>
-            <w:r>
-              <w:rPr>
-                <w:sz w:val="16"/>
-              </w:rPr>
-              <w:t xml:space="preserve"> models, the eight forms and the six workers, last changed at </w:t>
+              <w:t>c8556ba</w:t>
+            </w:r>
+            <w:r>
+              <w:rPr>
+                <w:sz w:val="16"/>
+              </w:rPr>
+              <w:t xml:space="preserve"> at worker level (Node.js), </w:t>
             </w:r>
             <w:r>
               <w:rPr>
@@ -421,27 +416,92 @@
               <w:rPr>
                 <w:sz w:val="16"/>
               </w:rPr>
-              <w:t xml:space="preserve">; only documentation changed between </w:t>
+              <w:t xml:space="preserve"> at model level</w:t>
+            </w:r>
+          </w:p>
+        </w:tc>
+      </w:tr>
+      <w:tr>
+        <w:tc>
+          <w:tcPr>
+            <w:tcW w:type="dxa" w:w="7070"/>
+          </w:tcPr>
+          <w:p>
+            <w:pPr>
+              <w:spacing w:after="0"/>
+              <w:jc w:val="left"/>
+            </w:pPr>
+            <w:r>
+              <w:rPr>
+                <w:sz w:val="16"/>
+              </w:rPr>
+            </w:r>
+            <w:r>
+              <w:rPr>
+                <w:sz w:val="16"/>
+              </w:rPr>
+              <w:t>Artefact versions</w:t>
+            </w:r>
+          </w:p>
+        </w:tc>
+        <w:tc>
+          <w:tcPr>
+            <w:tcW w:type="dxa" w:w="7070"/>
+          </w:tcPr>
+          <w:p>
+            <w:pPr>
+              <w:spacing w:after="0"/>
+              <w:jc w:val="left"/>
+            </w:pPr>
+            <w:r>
+              <w:rPr>
+                <w:sz w:val="16"/>
+              </w:rPr>
+            </w:r>
+            <w:r>
+              <w:rPr>
+                <w:sz w:val="16"/>
+              </w:rPr>
+              <w:t xml:space="preserve">the four </w:t>
             </w:r>
             <w:r>
               <w:rPr>
                 <w:rFonts w:ascii="Consolas" w:hAnsi="Consolas"/>
                 <w:sz w:val="17"/>
               </w:rPr>
-              <w:t>a7f0dd6</w:t>
-            </w:r>
-            <w:r>
-              <w:rPr>
-                <w:sz w:val="16"/>
-              </w:rPr>
-              <w:t xml:space="preserve"> and </w:t>
+              <w:t>core-N</w:t>
+            </w:r>
+            <w:r>
+              <w:rPr>
+                <w:sz w:val="16"/>
+              </w:rPr>
+              <w:t xml:space="preserve"> models; 40 Camunda Forms covering all 55 user tasks (</w:t>
             </w:r>
             <w:r>
               <w:rPr>
                 <w:rFonts w:ascii="Consolas" w:hAnsi="Consolas"/>
                 <w:sz w:val="17"/>
               </w:rPr>
-              <w:t>release-1.0</w:t>
+              <w:t>a62e783</w:t>
+            </w:r>
+            <w:r>
+              <w:rPr>
+                <w:sz w:val="16"/>
+              </w:rPr>
+              <w:t>); workers in Java (</w:t>
+            </w:r>
+            <w:r>
+              <w:rPr>
+                <w:rFonts w:ascii="Consolas" w:hAnsi="Consolas"/>
+                <w:sz w:val="17"/>
+              </w:rPr>
+              <w:t>4eb3fee</w:t>
+            </w:r>
+            <w:r>
+              <w:rPr>
+                <w:sz w:val="16"/>
+              </w:rPr>
+              <w:t>)</w:t>
             </w:r>
           </w:p>
         </w:tc>
@@ -716,7 +776,7 @@
               <w:rPr>
                 <w:sz w:val="16"/>
               </w:rPr>
-              <w:t xml:space="preserve">), the eight Camunda Forms in </w:t>
+              <w:t xml:space="preserve">), the 47 Camunda Forms in </w:t>
             </w:r>
             <w:r>
               <w:rPr>
@@ -795,7 +855,7 @@
                 <w:rFonts w:ascii="Consolas" w:hAnsi="Consolas"/>
                 <w:sz w:val="17"/>
               </w:rPr>
-              <w:t>npm test</w:t>
+              <w:t>mvn test</w:t>
             </w:r>
             <w:r>
               <w:rPr>
@@ -808,7 +868,7 @@
                 <w:rFonts w:ascii="Consolas" w:hAnsi="Consolas"/>
                 <w:sz w:val="17"/>
               </w:rPr>
-              <w:t>npm run test:smoke</w:t>
+              <w:t>mvn test -Pengine -Dtest=SmokeTest</w:t>
             </w:r>
             <w:r>
               <w:rPr>
@@ -821,7 +881,7 @@
                 <w:rFonts w:ascii="Consolas" w:hAnsi="Consolas"/>
                 <w:sz w:val="17"/>
               </w:rPr>
-              <w:t>npm run test:e2e</w:t>
+              <w:t>mvn test -Pengine -Dtest=OperationalModelsTest</w:t>
             </w:r>
             <w:r>
               <w:rPr>
@@ -12268,7 +12328,7 @@
         <w:t>DEF-12</w:t>
       </w:r>
       <w:r>
-        <w:t>), and 36 of the 55 user tasks bind no form, so the variables they must write are recorded nowhere (</w:t>
+        <w:t>), and 36 of the 55 user tasks bound no form, so the variables they must write were recorded nowhere (</w:t>
       </w:r>
       <w:r>
         <w:rPr>
@@ -12276,6 +12336,16 @@
           <w:sz w:val="17"/>
         </w:rPr>
         <w:t>DEF-13</w:t>
+      </w:r>
+      <w:r>
+        <w:t xml:space="preserve">, since fixed at </w:t>
+      </w:r>
+      <w:r>
+        <w:rPr>
+          <w:rFonts w:ascii="Consolas" w:hAnsi="Consolas"/>
+          <w:sz w:val="17"/>
+        </w:rPr>
+        <w:t>a62e783</w:t>
       </w:r>
       <w:r>
         <w:t>). Both are recorded in section 6 because a finding that only exists in a conversation is not evidence of anything.</w:t>
@@ -14753,7 +14823,27 @@
               <w:rPr>
                 <w:sz w:val="16"/>
               </w:rPr>
-              <w:t>Open</w:t>
+              <w:t xml:space="preserve">Fixed at </w:t>
+            </w:r>
+            <w:r>
+              <w:rPr>
+                <w:rFonts w:ascii="Consolas" w:hAnsi="Consolas"/>
+                <w:sz w:val="17"/>
+              </w:rPr>
+              <w:t>a62e783</w:t>
+            </w:r>
+            <w:r>
+              <w:rPr>
+                <w:sz w:val="16"/>
+              </w:rPr>
+              <w:t xml:space="preserve">; 40 forms cover all 55 user tasks. Writing them also showed that the eight forms that existed had never rendered a field, for the four reasons in </w:t>
+            </w:r>
+            <w:r>
+              <w:rPr>
+                <w:rFonts w:ascii="Consolas" w:hAnsi="Consolas"/>
+                <w:sz w:val="17"/>
+              </w:rPr>
+              <w:t>../forms/README.md</w:t>
             </w:r>
           </w:p>
         </w:tc>
@@ -14775,7 +14865,7 @@
               <w:rPr>
                 <w:sz w:val="16"/>
               </w:rPr>
-              <w:t>The end-to-end run supplies the variables a validated form would; the gap is that for these tasks there is no form to supply them from.</w:t>
+              <w:t>None needed</w:t>
             </w:r>
           </w:p>
         </w:tc>
@@ -14797,7 +14887,7 @@
               <w:rPr>
                 <w:sz w:val="16"/>
               </w:rPr>
-              <w:t>-</w:t>
+              <w:t>PB-006</w:t>
             </w:r>
           </w:p>
         </w:tc>
@@ -14906,7 +14996,7 @@
                 <w:rFonts w:ascii="Consolas" w:hAnsi="Consolas"/>
                 <w:sz w:val="17"/>
               </w:rPr>
-              <w:t>workers/src/services/scheduling-service.js</w:t>
+              <w:t>workers/src/main/java/uk/ac/uwe/hprtas/workers/services/SchedulingService.java</w:t>
             </w:r>
             <w:r>
               <w:rPr>
@@ -15026,7 +15116,7 @@
                 <w:rFonts w:ascii="Consolas" w:hAnsi="Consolas"/>
                 <w:sz w:val="17"/>
               </w:rPr>
-              <w:t>workers/src/services/treatment-service.js</w:t>
+              <w:t>workers/src/main/java/uk/ac/uwe/hprtas/workers/services/TreatmentService.java</w:t>
             </w:r>
             <w:r>
               <w:rPr>
@@ -15133,7 +15223,7 @@
                 <w:rFonts w:ascii="Consolas" w:hAnsi="Consolas"/>
                 <w:sz w:val="17"/>
               </w:rPr>
-              <w:t>workers/src/services/payment-service-provider.js</w:t>
+              <w:t>workers/src/main/java/uk/ac/uwe/hprtas/workers/services/PaymentServiceProvider.java</w:t>
             </w:r>
             <w:r>
               <w:rPr>
@@ -15318,7 +15408,7 @@
                 <w:rFonts w:ascii="Consolas" w:hAnsi="Consolas"/>
                 <w:sz w:val="17"/>
               </w:rPr>
-              <w:t>workers/src/services/correspondence-service.js</w:t>
+              <w:t>workers/src/main/java/uk/ac/uwe/hprtas/workers/services/CorrespondenceService.java</w:t>
             </w:r>
             <w:r>
               <w:rPr>

</xml_diff>

<commit_message>
Record the runs at 2c3c2eb, and give TC-03 the result the exchange produced
The engine run, the unit suite and the three static checks are written down in
`tests/evidence/core-5-message-exchange-and-layout-tidy_2c3c2eb_2026-09-28.txt`, which is what the
definition of done asks for: the version is in the file's name and its header, the method is stated
so the run can be repeated, and what the run does not cover is written down rather than left out -
the two defects no test can close, the reply being published by the scenario rather than by a
worker, and the other six diagrams keeping the routing this version repairs.

TC-03 is the case the exchange belongs to, and its row now names this version and this file as the
current result instead of the `c8556ba` unit record it had been carrying. The plan's own release row
still describes `release-1.0`, which is where it belongs until the next tag is cut.
</commit_message>
<xml_diff>
--- a/tests/exports/test-plan.docx
+++ b/tests/exports/test-plan.docx
@@ -8815,7 +8815,7 @@
               <w:rPr>
                 <w:sz w:val="16"/>
               </w:rPr>
-              <w:t>2026-09-21</w:t>
+              <w:t>2026-09-28</w:t>
             </w:r>
           </w:p>
         </w:tc>
@@ -8844,87 +8844,139 @@
                 <w:rFonts w:ascii="Consolas" w:hAnsi="Consolas"/>
                 <w:sz w:val="17"/>
               </w:rPr>
-              <w:t>cd workers &amp;&amp; npm test</w:t>
-            </w:r>
-          </w:p>
-        </w:tc>
-        <w:tc>
-          <w:tcPr>
-            <w:tcW w:type="dxa" w:w="2020"/>
-          </w:tcPr>
-          <w:p>
-            <w:pPr>
-              <w:spacing w:after="0"/>
-              <w:jc w:val="left"/>
-            </w:pPr>
-            <w:r>
-              <w:rPr>
-                <w:sz w:val="16"/>
-              </w:rPr>
+              <w:t>cd workers &amp;&amp; mvn test</w:t>
+            </w:r>
+            <w:r>
+              <w:rPr>
+                <w:sz w:val="16"/>
+              </w:rPr>
+              <w:t xml:space="preserve"> and </w:t>
             </w:r>
             <w:r>
               <w:rPr>
                 <w:rFonts w:ascii="Consolas" w:hAnsi="Consolas"/>
                 <w:sz w:val="17"/>
               </w:rPr>
-              <w:t>c8556ba</w:t>
-            </w:r>
-            <w:r>
-              <w:rPr>
-                <w:sz w:val="16"/>
-              </w:rPr>
-              <w:t xml:space="preserve"> ; </w:t>
+              <w:t>mvn test -Pengine</w:t>
+            </w:r>
+          </w:p>
+        </w:tc>
+        <w:tc>
+          <w:tcPr>
+            <w:tcW w:type="dxa" w:w="2020"/>
+          </w:tcPr>
+          <w:p>
+            <w:pPr>
+              <w:spacing w:after="0"/>
+              <w:jc w:val="left"/>
+            </w:pPr>
+            <w:r>
+              <w:rPr>
+                <w:sz w:val="16"/>
+              </w:rPr>
             </w:r>
             <w:r>
               <w:rPr>
                 <w:rFonts w:ascii="Consolas" w:hAnsi="Consolas"/>
                 <w:sz w:val="17"/>
               </w:rPr>
+              <w:t>2c3c2eb</w:t>
+            </w:r>
+            <w:r>
+              <w:rPr>
+                <w:sz w:val="16"/>
+              </w:rPr>
+              <w:t xml:space="preserve"> (the exchange published by a worker and correlated by referral; model level through </w:t>
+            </w:r>
+            <w:r>
+              <w:rPr>
+                <w:rFonts w:ascii="Consolas" w:hAnsi="Consolas"/>
+                <w:sz w:val="17"/>
+              </w:rPr>
+              <w:t>core-5</w:t>
+            </w:r>
+            <w:r>
+              <w:rPr>
+                <w:sz w:val="16"/>
+              </w:rPr>
+              <w:t>)</w:t>
+            </w:r>
+          </w:p>
+        </w:tc>
+        <w:tc>
+          <w:tcPr>
+            <w:tcW w:type="dxa" w:w="2020"/>
+          </w:tcPr>
+          <w:p>
+            <w:pPr>
+              <w:spacing w:after="0"/>
+              <w:jc w:val="left"/>
+            </w:pPr>
+            <w:r>
+              <w:rPr>
+                <w:sz w:val="16"/>
+              </w:rPr>
+            </w:r>
+            <w:r>
+              <w:rPr>
+                <w:sz w:val="16"/>
+              </w:rPr>
+              <w:t>Pass</w:t>
+            </w:r>
+          </w:p>
+        </w:tc>
+        <w:tc>
+          <w:tcPr>
+            <w:tcW w:type="dxa" w:w="2020"/>
+          </w:tcPr>
+          <w:p>
+            <w:pPr>
+              <w:spacing w:after="0"/>
+              <w:jc w:val="left"/>
+            </w:pPr>
+            <w:r>
+              <w:rPr>
+                <w:sz w:val="16"/>
+              </w:rPr>
+            </w:r>
+            <w:r>
+              <w:rPr>
+                <w:rFonts w:ascii="Consolas" w:hAnsi="Consolas"/>
+                <w:sz w:val="17"/>
+              </w:rPr>
+              <w:t>evidence/core-5-message-exchange-and-layout-tidy_2c3c2eb_2026-09-28.txt</w:t>
+            </w:r>
+            <w:r>
+              <w:rPr>
+                <w:sz w:val="16"/>
+              </w:rPr>
+              <w:t xml:space="preserve">; worker level at </w:t>
+            </w:r>
+            <w:r>
+              <w:rPr>
+                <w:rFonts w:ascii="Consolas" w:hAnsi="Consolas"/>
+                <w:sz w:val="17"/>
+              </w:rPr>
+              <w:t>c8556ba</w:t>
+            </w:r>
+            <w:r>
+              <w:rPr>
+                <w:sz w:val="16"/>
+              </w:rPr>
+              <w:t xml:space="preserve"> and </w:t>
+            </w:r>
+            <w:r>
+              <w:rPr>
+                <w:rFonts w:ascii="Consolas" w:hAnsi="Consolas"/>
+                <w:sz w:val="17"/>
+              </w:rPr>
               <w:t>76a7fdc</w:t>
             </w:r>
             <w:r>
               <w:rPr>
                 <w:sz w:val="16"/>
               </w:rPr>
-              <w:t xml:space="preserve"> (Java, all three levels)</w:t>
-            </w:r>
-          </w:p>
-        </w:tc>
-        <w:tc>
-          <w:tcPr>
-            <w:tcW w:type="dxa" w:w="2020"/>
-          </w:tcPr>
-          <w:p>
-            <w:pPr>
-              <w:spacing w:after="0"/>
-              <w:jc w:val="left"/>
-            </w:pPr>
-            <w:r>
-              <w:rPr>
-                <w:sz w:val="16"/>
-              </w:rPr>
-            </w:r>
-            <w:r>
-              <w:rPr>
-                <w:sz w:val="16"/>
-              </w:rPr>
-              <w:t>Pass</w:t>
-            </w:r>
-          </w:p>
-        </w:tc>
-        <w:tc>
-          <w:tcPr>
-            <w:tcW w:type="dxa" w:w="2020"/>
-          </w:tcPr>
-          <w:p>
-            <w:pPr>
-              <w:spacing w:after="0"/>
-              <w:jc w:val="left"/>
-            </w:pPr>
-            <w:r>
-              <w:rPr>
-                <w:sz w:val="16"/>
-              </w:rPr>
+              <w:t xml:space="preserve"> in </w:t>
             </w:r>
             <w:r>
               <w:rPr>

</xml_diff>

<commit_message>
Name the second release, and put its tag beside the submission one
The plan compares the two releases, so the second one needed a name in that series
as well as the submission tag it already carried. `release-2.0` now sits on the
submitted commit beside `submission-2026-09-29`, and `release-1.0` is left where it
is as the first-release baseline.

The documents that name the version were brought into step: `README.md`,
`tests/README.md`, the version section and the version table in `tests/test-plan.md`,
`models/README.md`, the fourth condition in the definition of done, both
demonstration scripts' version tables, the Sprint 4 tag row in `sprint-backlogs.md`
that expected `release-2.0` in the first place, R-08 in the project plan, and
section 7 of the plan evaluation.

`tests/exports/test-plan.docx` is regenerated from `test-plan.md`, which the
repository requires whenever the markdown changes.
</commit_message>
<xml_diff>
--- a/tests/exports/test-plan.docx
+++ b/tests/exports/test-plan.docx
@@ -87,7 +87,25 @@
     </w:p>
     <w:p>
       <w:r>
-        <w:t xml:space="preserve">Two tags name versions, and they are different versions. </w:t>
+        <w:t xml:space="preserve">Three tags name versions. Two of them sit together on the commit this file is committed in: </w:t>
+      </w:r>
+      <w:r>
+        <w:rPr>
+          <w:b/>
+        </w:rPr>
+        <w:t>`release-2.0`</w:t>
+      </w:r>
+      <w:r>
+        <w:t xml:space="preserve">, which marks that tree as the second release, and </w:t>
+      </w:r>
+      <w:r>
+        <w:rPr>
+          <w:b/>
+        </w:rPr>
+        <w:t>`submission-2026-09-29`</w:t>
+      </w:r>
+      <w:r>
+        <w:t xml:space="preserve">, which names it as the submission. The third, </w:t>
       </w:r>
       <w:r>
         <w:rPr>
@@ -97,7 +115,7 @@
         <w:t>release-1.0</w:t>
       </w:r>
       <w:r>
-        <w:t xml:space="preserve"> names the first release and resolves to </w:t>
+        <w:t xml:space="preserve">, names the first release and resolves to </w:t>
       </w:r>
       <w:r>
         <w:rPr>
@@ -107,16 +125,7 @@
         <w:t>69e01a1</w:t>
       </w:r>
       <w:r>
-        <w:t xml:space="preserve">; it stays where it is, because the records made at that version - the completed form set, the refund catch event - are only readable against it. The tree this file is committed in is tagged </w:t>
-      </w:r>
-      <w:r>
-        <w:rPr>
-          <w:b/>
-        </w:rPr>
-        <w:t>`submission-2026-09-29`</w:t>
-      </w:r>
-      <w:r>
-        <w:t xml:space="preserve">, and that is the version the project is submitted at. An earlier edition of this section recorded that the first-release tag no longer named the tree these records describe, and that either the tag had to move forward or the records had to be read as describing </w:t>
+        <w:t xml:space="preserve">; it stays where it is, because the records made at that version - the completed form set, the refund catch event - are only readable against it. An earlier edition of this section recorded that the first-release tag no longer named the tree these records describe, and that either the tag had to move forward or the records had to be read as describing </w:t>
       </w:r>
       <w:r>
         <w:rPr>
@@ -624,7 +633,20 @@
               <w:rPr>
                 <w:sz w:val="16"/>
               </w:rPr>
-              <w:t xml:space="preserve">, the tag on the commit this file is committed in: five </w:t>
+              <w:t xml:space="preserve"> and </w:t>
+            </w:r>
+            <w:r>
+              <w:rPr>
+                <w:rFonts w:ascii="Consolas" w:hAnsi="Consolas"/>
+                <w:sz w:val="17"/>
+              </w:rPr>
+              <w:t>release-2.0</w:t>
+            </w:r>
+            <w:r>
+              <w:rPr>
+                <w:sz w:val="16"/>
+              </w:rPr>
+              <w:t xml:space="preserve">, the tags on the commit this file is committed in: five </w:t>
             </w:r>
             <w:r>
               <w:rPr>

</xml_diff>